<commit_message>
Historias de Usuario Actualizadas 25-Jun-2025
</commit_message>
<xml_diff>
--- a/PPAFE/03 ANALSIS DE REQUERIMIENTOS/PPAFE_HU_Portal.docx
+++ b/PPAFE/03 ANALSIS DE REQUERIMIENTOS/PPAFE_HU_Portal.docx
@@ -23,29 +23,7 @@
           <w:szCs w:val="36"/>
           <w:lang w:val="es-ES"/>
         </w:rPr>
-        <w:t xml:space="preserve">PPAFE </w:t>
-      </w:r>
-      <w:r>
-        <w:rPr>
-          <w:rFonts w:asciiTheme="minorHAnsi" w:hAnsiTheme="minorHAnsi" w:cstheme="minorHAnsi"/>
-          <w:b/>
-          <w:bCs/>
-          <w:sz w:val="36"/>
-          <w:szCs w:val="36"/>
-          <w:lang w:val="es-ES"/>
-        </w:rPr>
-        <w:t xml:space="preserve">Portal </w:t>
-      </w:r>
-      <w:r>
-        <w:rPr>
-          <w:rFonts w:asciiTheme="minorHAnsi" w:hAnsiTheme="minorHAnsi" w:cstheme="minorHAnsi"/>
-          <w:b/>
-          <w:bCs/>
-          <w:sz w:val="36"/>
-          <w:szCs w:val="36"/>
-          <w:lang w:val="es-ES"/>
-        </w:rPr>
-        <w:t>- Historias de Usuario “HU”</w:t>
+        <w:t>PPAFE Portal - Historias de Usuario “HU”</w:t>
       </w:r>
     </w:p>
     <w:p>
@@ -460,7 +438,20 @@
         <w:rPr>
           <w:rFonts w:asciiTheme="minorHAnsi" w:hAnsiTheme="minorHAnsi" w:cstheme="minorHAnsi"/>
         </w:rPr>
-        <w:t xml:space="preserve"> deberá visualizar un gráfico informativo debajo de los botones principales, que represente una visión general de los fondos y montos disponibles en el sistema.</w:t>
+        <w:t xml:space="preserve"> deberá visualizar un gráfico </w:t>
+      </w:r>
+      <w:r>
+        <w:rPr>
+          <w:rFonts w:asciiTheme="minorHAnsi" w:hAnsiTheme="minorHAnsi" w:cstheme="minorHAnsi"/>
+          <w:lang w:val="es-ES"/>
+        </w:rPr>
+        <w:t xml:space="preserve">de barras </w:t>
+      </w:r>
+      <w:r>
+        <w:rPr>
+          <w:rFonts w:asciiTheme="minorHAnsi" w:hAnsiTheme="minorHAnsi" w:cstheme="minorHAnsi"/>
+        </w:rPr>
+        <w:t>informativo debajo de los botones principales, que represente una visión general de los fondos y montos disponibles en el sistema.</w:t>
       </w:r>
     </w:p>
     <w:p>
@@ -474,14 +465,14 @@
         <w:rPr>
           <w:rFonts w:asciiTheme="minorHAnsi" w:hAnsiTheme="minorHAnsi" w:cstheme="minorHAnsi"/>
           <w:noProof/>
-          <w:lang w:val="es-MX"/>
+          <w14:ligatures w14:val="standardContextual"/>
         </w:rPr>
         <w:lastRenderedPageBreak/>
         <w:drawing>
-          <wp:inline distT="0" distB="0" distL="0" distR="0" wp14:anchorId="2A0DB851" wp14:editId="6B64B2F2">
-            <wp:extent cx="5040000" cy="3346885"/>
-            <wp:effectExtent l="0" t="0" r="1905" b="6350"/>
-            <wp:docPr id="1247760055" name="Picture 3"/>
+          <wp:inline distT="0" distB="0" distL="0" distR="0">
+            <wp:extent cx="5040000" cy="3348692"/>
+            <wp:effectExtent l="0" t="0" r="1905" b="4445"/>
+            <wp:docPr id="1271903404" name="Picture 3"/>
             <wp:cNvGraphicFramePr>
               <a:graphicFrameLocks xmlns:a="http://schemas.openxmlformats.org/drawingml/2006/main" noChangeAspect="1"/>
             </wp:cNvGraphicFramePr>
@@ -489,11 +480,11 @@
               <a:graphicData uri="http://schemas.openxmlformats.org/drawingml/2006/picture">
                 <pic:pic xmlns:pic="http://schemas.openxmlformats.org/drawingml/2006/picture">
                   <pic:nvPicPr>
-                    <pic:cNvPr id="1247760055" name="Picture 1247760055"/>
+                    <pic:cNvPr id="1271903404" name="Picture 1271903404"/>
                     <pic:cNvPicPr/>
                   </pic:nvPicPr>
                   <pic:blipFill>
-                    <a:blip r:embed="rId5" cstate="print">
+                    <a:blip r:embed="rId5">
                       <a:extLst>
                         <a:ext uri="{28A0092B-C50C-407E-A947-70E740481C1C}">
                           <a14:useLocalDpi xmlns:a14="http://schemas.microsoft.com/office/drawing/2010/main" val="0"/>
@@ -507,7 +498,7 @@
                   <pic:spPr>
                     <a:xfrm>
                       <a:off x="0" y="0"/>
-                      <a:ext cx="5040000" cy="3346885"/>
+                      <a:ext cx="5040000" cy="3348692"/>
                     </a:xfrm>
                     <a:prstGeom prst="rect">
                       <a:avLst/>
@@ -1320,20 +1311,116 @@
           <w:rStyle w:val="Strong"/>
           <w:rFonts w:asciiTheme="minorHAnsi" w:hAnsiTheme="minorHAnsi" w:cstheme="minorHAnsi"/>
         </w:rPr>
-        <w:t xml:space="preserve"> - Cálculo y Visualización de Totales por Fondo</w:t>
-      </w:r>
-      <w:r>
-        <w:rPr>
-          <w:rStyle w:val="Strong"/>
-          <w:rFonts w:asciiTheme="minorHAnsi" w:hAnsiTheme="minorHAnsi" w:cstheme="minorHAnsi"/>
-        </w:rPr>
+        <w:t xml:space="preserve"> - Cálculo y Visualización de Totales por Fondo (Acumulados y Redondeados)</w:t>
+      </w:r>
+      <w:r>
+        <w:rPr>
+          <w:rFonts w:asciiTheme="minorHAnsi" w:hAnsiTheme="minorHAnsi" w:cstheme="minorHAnsi"/>
+        </w:rPr>
+        <w:br/>
+      </w:r>
+      <w:r>
+        <w:rPr>
+          <w:rStyle w:val="Strong"/>
+          <w:rFonts w:asciiTheme="minorHAnsi" w:hAnsiTheme="minorHAnsi" w:cstheme="minorHAnsi"/>
+        </w:rPr>
+        <w:t>Dado que</w:t>
+      </w:r>
+      <w:r>
+        <w:rPr>
+          <w:rFonts w:asciiTheme="minorHAnsi" w:hAnsiTheme="minorHAnsi" w:cstheme="minorHAnsi"/>
+        </w:rPr>
+        <w:t xml:space="preserve"> la tabla de montos presenta fondos en columnas</w:t>
+      </w:r>
+      <w:r>
         <w:t xml:space="preserve"> </w:t>
       </w:r>
       <w:r>
         <w:rPr>
-          <w:rStyle w:val="Strong"/>
-          <w:rFonts w:asciiTheme="minorHAnsi" w:hAnsiTheme="minorHAnsi" w:cstheme="minorHAnsi"/>
-          <w:highlight w:val="yellow"/>
+          <w:rFonts w:asciiTheme="minorHAnsi" w:hAnsiTheme="minorHAnsi" w:cstheme="minorHAnsi"/>
+        </w:rPr>
+        <w:t>y el usuario ha seleccionado un periodo (Mensual, Trimestral, Anual),</w:t>
+      </w:r>
+      <w:r>
+        <w:rPr>
+          <w:rFonts w:asciiTheme="minorHAnsi" w:hAnsiTheme="minorHAnsi" w:cstheme="minorHAnsi"/>
+        </w:rPr>
+        <w:br/>
+      </w:r>
+      <w:r>
+        <w:rPr>
+          <w:rStyle w:val="Strong"/>
+          <w:rFonts w:asciiTheme="minorHAnsi" w:hAnsiTheme="minorHAnsi" w:cstheme="minorHAnsi"/>
+        </w:rPr>
+        <w:t>Cuando</w:t>
+      </w:r>
+      <w:r>
+        <w:rPr>
+          <w:rFonts w:asciiTheme="minorHAnsi" w:hAnsiTheme="minorHAnsi" w:cstheme="minorHAnsi"/>
+        </w:rPr>
+        <w:t xml:space="preserve"> se muestren los datos en la tabla,</w:t>
+      </w:r>
+      <w:r>
+        <w:rPr>
+          <w:rFonts w:asciiTheme="minorHAnsi" w:hAnsiTheme="minorHAnsi" w:cstheme="minorHAnsi"/>
+        </w:rPr>
+        <w:br/>
+      </w:r>
+      <w:r>
+        <w:rPr>
+          <w:rStyle w:val="Strong"/>
+          <w:rFonts w:asciiTheme="minorHAnsi" w:hAnsiTheme="minorHAnsi" w:cstheme="minorHAnsi"/>
+        </w:rPr>
+        <w:t>Entonces</w:t>
+      </w:r>
+      <w:r>
+        <w:rPr>
+          <w:rFonts w:asciiTheme="minorHAnsi" w:hAnsiTheme="minorHAnsi" w:cstheme="minorHAnsi"/>
+        </w:rPr>
+        <w:t xml:space="preserve"> al final de cada columna deberá aparecer un total que represente la suma acumulada de todos los montos correspondientes a ese fondo, redondeado a pesos (sin decimales).</w:t>
+      </w:r>
+    </w:p>
+    <w:p>
+      <w:pPr>
+        <w:pStyle w:val="NormalWeb"/>
+        <w:rPr>
+          <w:rFonts w:asciiTheme="minorHAnsi" w:hAnsiTheme="minorHAnsi" w:cstheme="minorHAnsi"/>
+        </w:rPr>
+      </w:pPr>
+      <w:r>
+        <w:rPr>
+          <w:rStyle w:val="Strong"/>
+          <w:rFonts w:asciiTheme="minorHAnsi" w:hAnsiTheme="minorHAnsi" w:cstheme="minorHAnsi"/>
+        </w:rPr>
+        <w:t xml:space="preserve">Criterio </w:t>
+      </w:r>
+      <w:r>
+        <w:rPr>
+          <w:rStyle w:val="Strong"/>
+          <w:rFonts w:asciiTheme="minorHAnsi" w:hAnsiTheme="minorHAnsi" w:cstheme="minorHAnsi"/>
+          <w:lang w:val="es-ES"/>
+        </w:rPr>
+        <w:t>6</w:t>
+      </w:r>
+      <w:r>
+        <w:rPr>
+          <w:rStyle w:val="Strong"/>
+          <w:rFonts w:asciiTheme="minorHAnsi" w:hAnsiTheme="minorHAnsi" w:cstheme="minorHAnsi"/>
+        </w:rPr>
+        <w:t xml:space="preserve"> - Cálculo y Visualización de Totales por Municipio</w:t>
+      </w:r>
+      <w:r>
+        <w:rPr>
+          <w:rStyle w:val="Strong"/>
+          <w:rFonts w:asciiTheme="minorHAnsi" w:hAnsiTheme="minorHAnsi" w:cstheme="minorHAnsi"/>
+          <w:lang w:val="es-ES"/>
+        </w:rPr>
+        <w:t xml:space="preserve"> </w:t>
+      </w:r>
+      <w:r>
+        <w:rPr>
+          <w:rStyle w:val="Strong"/>
+          <w:rFonts w:asciiTheme="minorHAnsi" w:hAnsiTheme="minorHAnsi" w:cstheme="minorHAnsi"/>
         </w:rPr>
         <w:t>(Acumulados y Redondeados)</w:t>
       </w:r>
@@ -1354,7 +1441,45 @@
         <w:rPr>
           <w:rFonts w:asciiTheme="minorHAnsi" w:hAnsiTheme="minorHAnsi" w:cstheme="minorHAnsi"/>
         </w:rPr>
-        <w:t xml:space="preserve"> la tabla de montos presenta fondos en columnas</w:t>
+        <w:t xml:space="preserve"> la tabla de montos presenta municipios en filas y el usuario ha seleccionado un periodo (Mensual, Trimestral, Anual),</w:t>
+      </w:r>
+      <w:r>
+        <w:rPr>
+          <w:rFonts w:asciiTheme="minorHAnsi" w:hAnsiTheme="minorHAnsi" w:cstheme="minorHAnsi"/>
+        </w:rPr>
+        <w:br/>
+      </w:r>
+      <w:r>
+        <w:rPr>
+          <w:rStyle w:val="Strong"/>
+          <w:rFonts w:asciiTheme="minorHAnsi" w:hAnsiTheme="minorHAnsi" w:cstheme="minorHAnsi"/>
+        </w:rPr>
+        <w:t>Cuando</w:t>
+      </w:r>
+      <w:r>
+        <w:rPr>
+          <w:rFonts w:asciiTheme="minorHAnsi" w:hAnsiTheme="minorHAnsi" w:cstheme="minorHAnsi"/>
+        </w:rPr>
+        <w:t xml:space="preserve"> se muestren los datos en la tabla,</w:t>
+      </w:r>
+      <w:r>
+        <w:rPr>
+          <w:rFonts w:asciiTheme="minorHAnsi" w:hAnsiTheme="minorHAnsi" w:cstheme="minorHAnsi"/>
+        </w:rPr>
+        <w:br/>
+      </w:r>
+      <w:r>
+        <w:rPr>
+          <w:rStyle w:val="Strong"/>
+          <w:rFonts w:asciiTheme="minorHAnsi" w:hAnsiTheme="minorHAnsi" w:cstheme="minorHAnsi"/>
+        </w:rPr>
+        <w:t>Entonces</w:t>
+      </w:r>
+      <w:r>
+        <w:rPr>
+          <w:rFonts w:asciiTheme="minorHAnsi" w:hAnsiTheme="minorHAnsi" w:cstheme="minorHAnsi"/>
+        </w:rPr>
+        <w:t xml:space="preserve"> al final de cada fila deberá aparecer un total que represente la suma</w:t>
       </w:r>
       <w:r>
         <w:t xml:space="preserve"> </w:t>
@@ -1362,224 +1487,8 @@
       <w:r>
         <w:rPr>
           <w:rFonts w:asciiTheme="minorHAnsi" w:hAnsiTheme="minorHAnsi" w:cstheme="minorHAnsi"/>
-          <w:highlight w:val="yellow"/>
-        </w:rPr>
-        <w:t>y el usuario ha seleccionado un periodo (Mensual, Trimestral, Anual)</w:t>
-      </w:r>
-      <w:r>
-        <w:rPr>
-          <w:rFonts w:asciiTheme="minorHAnsi" w:hAnsiTheme="minorHAnsi" w:cstheme="minorHAnsi"/>
-        </w:rPr>
-        <w:t>,</w:t>
-      </w:r>
-      <w:r>
-        <w:rPr>
-          <w:rFonts w:asciiTheme="minorHAnsi" w:hAnsiTheme="minorHAnsi" w:cstheme="minorHAnsi"/>
-        </w:rPr>
-        <w:br/>
-      </w:r>
-      <w:r>
-        <w:rPr>
-          <w:rStyle w:val="Strong"/>
-          <w:rFonts w:asciiTheme="minorHAnsi" w:hAnsiTheme="minorHAnsi" w:cstheme="minorHAnsi"/>
-        </w:rPr>
-        <w:t>Cuando</w:t>
-      </w:r>
-      <w:r>
-        <w:rPr>
-          <w:rFonts w:asciiTheme="minorHAnsi" w:hAnsiTheme="minorHAnsi" w:cstheme="minorHAnsi"/>
-        </w:rPr>
-        <w:t xml:space="preserve"> se muestren los datos en la tabla,</w:t>
-      </w:r>
-      <w:r>
-        <w:rPr>
-          <w:rFonts w:asciiTheme="minorHAnsi" w:hAnsiTheme="minorHAnsi" w:cstheme="minorHAnsi"/>
-        </w:rPr>
-        <w:br/>
-      </w:r>
-      <w:r>
-        <w:rPr>
-          <w:rStyle w:val="Strong"/>
-          <w:rFonts w:asciiTheme="minorHAnsi" w:hAnsiTheme="minorHAnsi" w:cstheme="minorHAnsi"/>
-        </w:rPr>
-        <w:t>Entonces</w:t>
-      </w:r>
-      <w:r>
-        <w:rPr>
-          <w:rFonts w:asciiTheme="minorHAnsi" w:hAnsiTheme="minorHAnsi" w:cstheme="minorHAnsi"/>
-        </w:rPr>
-        <w:t xml:space="preserve"> al final de cada columna deberá aparecer un total que represente la suma </w:t>
-      </w:r>
-      <w:r>
-        <w:rPr>
-          <w:rFonts w:asciiTheme="minorHAnsi" w:hAnsiTheme="minorHAnsi" w:cstheme="minorHAnsi"/>
-          <w:highlight w:val="yellow"/>
-        </w:rPr>
-        <w:t>acumulada</w:t>
-      </w:r>
-      <w:r>
-        <w:rPr>
-          <w:rFonts w:asciiTheme="minorHAnsi" w:hAnsiTheme="minorHAnsi" w:cstheme="minorHAnsi"/>
-        </w:rPr>
-        <w:t xml:space="preserve"> de todos los montos correspondientes a ese fondo</w:t>
-      </w:r>
-      <w:r>
-        <w:rPr>
-          <w:rFonts w:asciiTheme="minorHAnsi" w:hAnsiTheme="minorHAnsi" w:cstheme="minorHAnsi"/>
-          <w:highlight w:val="yellow"/>
-        </w:rPr>
-        <w:t>, redondeado a pesos (sin decimales)</w:t>
-      </w:r>
-      <w:r>
-        <w:rPr>
-          <w:rFonts w:asciiTheme="minorHAnsi" w:hAnsiTheme="minorHAnsi" w:cstheme="minorHAnsi"/>
-        </w:rPr>
-        <w:t>.</w:t>
-      </w:r>
-    </w:p>
-    <w:p>
-      <w:pPr>
-        <w:pStyle w:val="NormalWeb"/>
-        <w:rPr>
-          <w:rFonts w:asciiTheme="minorHAnsi" w:hAnsiTheme="minorHAnsi" w:cstheme="minorHAnsi"/>
-        </w:rPr>
-      </w:pPr>
-      <w:r>
-        <w:rPr>
-          <w:rStyle w:val="Strong"/>
-          <w:rFonts w:asciiTheme="minorHAnsi" w:hAnsiTheme="minorHAnsi" w:cstheme="minorHAnsi"/>
-        </w:rPr>
-        <w:t xml:space="preserve">Criterio </w:t>
-      </w:r>
-      <w:r>
-        <w:rPr>
-          <w:rStyle w:val="Strong"/>
-          <w:rFonts w:asciiTheme="minorHAnsi" w:hAnsiTheme="minorHAnsi" w:cstheme="minorHAnsi"/>
-          <w:lang w:val="es-ES"/>
-        </w:rPr>
-        <w:t>6</w:t>
-      </w:r>
-      <w:r>
-        <w:rPr>
-          <w:rStyle w:val="Strong"/>
-          <w:rFonts w:asciiTheme="minorHAnsi" w:hAnsiTheme="minorHAnsi" w:cstheme="minorHAnsi"/>
-        </w:rPr>
-        <w:t xml:space="preserve"> - Cálculo y Visualización de Totales por Municipio</w:t>
-      </w:r>
-      <w:r>
-        <w:rPr>
-          <w:rStyle w:val="Strong"/>
-          <w:rFonts w:asciiTheme="minorHAnsi" w:hAnsiTheme="minorHAnsi" w:cstheme="minorHAnsi"/>
-          <w:lang w:val="es-ES"/>
-        </w:rPr>
-        <w:t xml:space="preserve"> </w:t>
-      </w:r>
-      <w:r>
-        <w:rPr>
-          <w:rStyle w:val="Strong"/>
-          <w:rFonts w:asciiTheme="minorHAnsi" w:hAnsiTheme="minorHAnsi" w:cstheme="minorHAnsi"/>
-          <w:highlight w:val="yellow"/>
-        </w:rPr>
-        <w:t>(Acumulados y Redondeados)</w:t>
-      </w:r>
-      <w:r>
-        <w:rPr>
-          <w:rFonts w:asciiTheme="minorHAnsi" w:hAnsiTheme="minorHAnsi" w:cstheme="minorHAnsi"/>
-        </w:rPr>
-        <w:br/>
-      </w:r>
-      <w:r>
-        <w:rPr>
-          <w:rStyle w:val="Strong"/>
-          <w:rFonts w:asciiTheme="minorHAnsi" w:hAnsiTheme="minorHAnsi" w:cstheme="minorHAnsi"/>
-        </w:rPr>
-        <w:t>Dado que</w:t>
-      </w:r>
-      <w:r>
-        <w:rPr>
-          <w:rFonts w:asciiTheme="minorHAnsi" w:hAnsiTheme="minorHAnsi" w:cstheme="minorHAnsi"/>
-        </w:rPr>
-        <w:t xml:space="preserve"> la tabla de montos presenta municipios en filas</w:t>
-      </w:r>
-      <w:r>
-        <w:rPr>
-          <w:rFonts w:asciiTheme="minorHAnsi" w:hAnsiTheme="minorHAnsi" w:cstheme="minorHAnsi"/>
-          <w:highlight w:val="yellow"/>
-        </w:rPr>
-        <w:t xml:space="preserve"> y el usuario ha seleccionado un periodo (Mensual, Trimestral, Anual)</w:t>
-      </w:r>
-      <w:r>
-        <w:rPr>
-          <w:rFonts w:asciiTheme="minorHAnsi" w:hAnsiTheme="minorHAnsi" w:cstheme="minorHAnsi"/>
-        </w:rPr>
-        <w:t>,</w:t>
-      </w:r>
-      <w:r>
-        <w:rPr>
-          <w:rFonts w:asciiTheme="minorHAnsi" w:hAnsiTheme="minorHAnsi" w:cstheme="minorHAnsi"/>
-        </w:rPr>
-        <w:br/>
-      </w:r>
-      <w:r>
-        <w:rPr>
-          <w:rStyle w:val="Strong"/>
-          <w:rFonts w:asciiTheme="minorHAnsi" w:hAnsiTheme="minorHAnsi" w:cstheme="minorHAnsi"/>
-        </w:rPr>
-        <w:t>Cuando</w:t>
-      </w:r>
-      <w:r>
-        <w:rPr>
-          <w:rFonts w:asciiTheme="minorHAnsi" w:hAnsiTheme="minorHAnsi" w:cstheme="minorHAnsi"/>
-        </w:rPr>
-        <w:t xml:space="preserve"> se muestren los datos en la tabla,</w:t>
-      </w:r>
-      <w:r>
-        <w:rPr>
-          <w:rFonts w:asciiTheme="minorHAnsi" w:hAnsiTheme="minorHAnsi" w:cstheme="minorHAnsi"/>
-        </w:rPr>
-        <w:br/>
-      </w:r>
-      <w:r>
-        <w:rPr>
-          <w:rStyle w:val="Strong"/>
-          <w:rFonts w:asciiTheme="minorHAnsi" w:hAnsiTheme="minorHAnsi" w:cstheme="minorHAnsi"/>
-        </w:rPr>
-        <w:t>Entonces</w:t>
-      </w:r>
-      <w:r>
-        <w:rPr>
-          <w:rFonts w:asciiTheme="minorHAnsi" w:hAnsiTheme="minorHAnsi" w:cstheme="minorHAnsi"/>
-        </w:rPr>
-        <w:t xml:space="preserve"> al final de cada fila deberá aparecer un total que represente la suma</w:t>
-      </w:r>
-      <w:r>
-        <w:t xml:space="preserve"> </w:t>
-      </w:r>
-      <w:r>
-        <w:rPr>
-          <w:rFonts w:asciiTheme="minorHAnsi" w:hAnsiTheme="minorHAnsi" w:cstheme="minorHAnsi"/>
-          <w:highlight w:val="yellow"/>
-        </w:rPr>
-        <w:t>acumulada</w:t>
-      </w:r>
-      <w:r>
-        <w:rPr>
-          <w:rFonts w:asciiTheme="minorHAnsi" w:hAnsiTheme="minorHAnsi" w:cstheme="minorHAnsi"/>
-        </w:rPr>
-        <w:t xml:space="preserve"> de los montos asignados a ese municipio</w:t>
-      </w:r>
-      <w:r>
-        <w:rPr>
-          <w:rFonts w:asciiTheme="minorHAnsi" w:hAnsiTheme="minorHAnsi" w:cstheme="minorHAnsi"/>
-          <w:highlight w:val="yellow"/>
-        </w:rPr>
-        <w:t>, redondeado a pesos (sin decimales)</w:t>
-      </w:r>
-      <w:r>
-        <w:rPr>
-          <w:rFonts w:asciiTheme="minorHAnsi" w:hAnsiTheme="minorHAnsi" w:cstheme="minorHAnsi"/>
-        </w:rPr>
-        <w:t>.</w:t>
+        </w:rPr>
+        <w:t>acumulada de los montos asignados a ese municipio, redondeado a pesos (sin decimales).</w:t>
       </w:r>
     </w:p>
     <w:p>
@@ -1682,7 +1591,6 @@
           <w:rFonts w:asciiTheme="minorHAnsi" w:hAnsiTheme="minorHAnsi" w:cstheme="minorHAnsi"/>
           <w:b/>
           <w:bCs/>
-          <w:highlight w:val="yellow"/>
         </w:rPr>
         <w:t>Criterio 8 - Nota Aclaratoria de Redondeo</w:t>
       </w:r>
@@ -1691,7 +1599,6 @@
           <w:rFonts w:asciiTheme="minorHAnsi" w:hAnsiTheme="minorHAnsi" w:cstheme="minorHAnsi"/>
           <w:b/>
           <w:bCs/>
-          <w:highlight w:val="yellow"/>
         </w:rPr>
         <w:br/>
         <w:t>Dado que</w:t>
@@ -1699,14 +1606,12 @@
       <w:r>
         <w:rPr>
           <w:rFonts w:asciiTheme="minorHAnsi" w:hAnsiTheme="minorHAnsi" w:cstheme="minorHAnsi"/>
-          <w:highlight w:val="yellow"/>
         </w:rPr>
         <w:t xml:space="preserve"> los totales se calculan sobre montos redondeados,</w:t>
       </w:r>
       <w:r>
         <w:rPr>
           <w:rFonts w:asciiTheme="minorHAnsi" w:hAnsiTheme="minorHAnsi" w:cstheme="minorHAnsi"/>
-          <w:highlight w:val="yellow"/>
         </w:rPr>
         <w:br/>
       </w:r>
@@ -1715,21 +1620,18 @@
           <w:rFonts w:asciiTheme="minorHAnsi" w:hAnsiTheme="minorHAnsi" w:cstheme="minorHAnsi"/>
           <w:b/>
           <w:bCs/>
-          <w:highlight w:val="yellow"/>
         </w:rPr>
         <w:t>Cuando</w:t>
       </w:r>
       <w:r>
         <w:rPr>
           <w:rFonts w:asciiTheme="minorHAnsi" w:hAnsiTheme="minorHAnsi" w:cstheme="minorHAnsi"/>
-          <w:highlight w:val="yellow"/>
         </w:rPr>
         <w:t xml:space="preserve"> se muestre la tabla de montos,</w:t>
       </w:r>
       <w:r>
         <w:rPr>
           <w:rFonts w:asciiTheme="minorHAnsi" w:hAnsiTheme="minorHAnsi" w:cstheme="minorHAnsi"/>
-          <w:highlight w:val="yellow"/>
         </w:rPr>
         <w:br/>
       </w:r>
@@ -1738,14 +1640,12 @@
           <w:rFonts w:asciiTheme="minorHAnsi" w:hAnsiTheme="minorHAnsi" w:cstheme="minorHAnsi"/>
           <w:b/>
           <w:bCs/>
-          <w:highlight w:val="yellow"/>
         </w:rPr>
         <w:t>Entonces</w:t>
       </w:r>
       <w:r>
         <w:rPr>
           <w:rFonts w:asciiTheme="minorHAnsi" w:hAnsiTheme="minorHAnsi" w:cstheme="minorHAnsi"/>
-          <w:highlight w:val="yellow"/>
         </w:rPr>
         <w:t xml:space="preserve"> deberá aparecer una nota visible debajo de la tabla indicando: "</w:t>
       </w:r>
@@ -1754,14 +1654,12 @@
           <w:rFonts w:asciiTheme="minorHAnsi" w:hAnsiTheme="minorHAnsi" w:cstheme="minorHAnsi"/>
           <w:b/>
           <w:bCs/>
-          <w:highlight w:val="yellow"/>
         </w:rPr>
         <w:t>Las sumas pueden no coincidir con los totales reportados debido al redondeo individual de los montos.</w:t>
       </w:r>
       <w:r>
         <w:rPr>
           <w:rFonts w:asciiTheme="minorHAnsi" w:hAnsiTheme="minorHAnsi" w:cstheme="minorHAnsi"/>
-          <w:highlight w:val="yellow"/>
         </w:rPr>
         <w:t>"</w:t>
       </w:r>
@@ -1778,7 +1676,6 @@
         <w:pStyle w:val="NormalWeb"/>
         <w:rPr>
           <w:rFonts w:asciiTheme="minorHAnsi" w:hAnsiTheme="minorHAnsi" w:cstheme="minorHAnsi"/>
-          <w:highlight w:val="yellow"/>
           <w:lang w:val="es-ES"/>
         </w:rPr>
       </w:pPr>
@@ -1787,7 +1684,6 @@
           <w:rFonts w:asciiTheme="minorHAnsi" w:hAnsiTheme="minorHAnsi" w:cstheme="minorHAnsi"/>
           <w:b/>
           <w:bCs/>
-          <w:highlight w:val="yellow"/>
           <w:lang w:val="es-ES"/>
         </w:rPr>
         <w:t>Criterio 9 - Vista Inicial por Defecto:</w:t>
@@ -1797,7 +1693,6 @@
           <w:rFonts w:asciiTheme="minorHAnsi" w:hAnsiTheme="minorHAnsi" w:cstheme="minorHAnsi"/>
           <w:b/>
           <w:bCs/>
-          <w:highlight w:val="yellow"/>
           <w:lang w:val="es-ES"/>
         </w:rPr>
         <w:br/>
@@ -1806,7 +1701,6 @@
       <w:r>
         <w:rPr>
           <w:rFonts w:asciiTheme="minorHAnsi" w:hAnsiTheme="minorHAnsi" w:cstheme="minorHAnsi"/>
-          <w:highlight w:val="yellow"/>
           <w:lang w:val="es-ES"/>
         </w:rPr>
         <w:t xml:space="preserve"> el usuario accede a la página de Montos sin filtros previos,</w:t>
@@ -1814,7 +1708,6 @@
       <w:r>
         <w:rPr>
           <w:rFonts w:asciiTheme="minorHAnsi" w:hAnsiTheme="minorHAnsi" w:cstheme="minorHAnsi"/>
-          <w:highlight w:val="yellow"/>
           <w:lang w:val="es-ES"/>
         </w:rPr>
         <w:br/>
@@ -1824,7 +1717,6 @@
           <w:rFonts w:asciiTheme="minorHAnsi" w:hAnsiTheme="minorHAnsi" w:cstheme="minorHAnsi"/>
           <w:b/>
           <w:bCs/>
-          <w:highlight w:val="yellow"/>
           <w:lang w:val="es-ES"/>
         </w:rPr>
         <w:t>Cuando</w:t>
@@ -1832,7 +1724,6 @@
       <w:r>
         <w:rPr>
           <w:rFonts w:asciiTheme="minorHAnsi" w:hAnsiTheme="minorHAnsi" w:cstheme="minorHAnsi"/>
-          <w:highlight w:val="yellow"/>
           <w:lang w:val="es-ES"/>
         </w:rPr>
         <w:t xml:space="preserve"> la página cargue inicialmente,</w:t>
@@ -1840,7 +1731,6 @@
       <w:r>
         <w:rPr>
           <w:rFonts w:asciiTheme="minorHAnsi" w:hAnsiTheme="minorHAnsi" w:cstheme="minorHAnsi"/>
-          <w:highlight w:val="yellow"/>
           <w:lang w:val="es-ES"/>
         </w:rPr>
         <w:br/>
@@ -1850,7 +1740,6 @@
           <w:rFonts w:asciiTheme="minorHAnsi" w:hAnsiTheme="minorHAnsi" w:cstheme="minorHAnsi"/>
           <w:b/>
           <w:bCs/>
-          <w:highlight w:val="yellow"/>
           <w:lang w:val="es-ES"/>
         </w:rPr>
         <w:t>Entonces</w:t>
@@ -1858,7 +1747,6 @@
       <w:r>
         <w:rPr>
           <w:rFonts w:asciiTheme="minorHAnsi" w:hAnsiTheme="minorHAnsi" w:cstheme="minorHAnsi"/>
-          <w:highlight w:val="yellow"/>
           <w:lang w:val="es-ES"/>
         </w:rPr>
         <w:t xml:space="preserve"> deberá mostrar automáticamente los datos correspondientes al último mes y año con información disponible, con todos los Municipios y todos los Fondos seleccionados/mostrados por defecto.</w:t>
@@ -1876,7 +1764,6 @@
           <w:rFonts w:asciiTheme="minorHAnsi" w:hAnsiTheme="minorHAnsi" w:cstheme="minorHAnsi"/>
           <w:b/>
           <w:bCs/>
-          <w:highlight w:val="yellow"/>
           <w:lang w:val="es-ES"/>
         </w:rPr>
         <w:t>Criterio 10 - Formato Título Descarga:</w:t>
@@ -1886,7 +1773,6 @@
           <w:rFonts w:asciiTheme="minorHAnsi" w:hAnsiTheme="minorHAnsi" w:cstheme="minorHAnsi"/>
           <w:b/>
           <w:bCs/>
-          <w:highlight w:val="yellow"/>
           <w:lang w:val="es-ES"/>
         </w:rPr>
         <w:br/>
@@ -1895,7 +1781,6 @@
       <w:r>
         <w:rPr>
           <w:rFonts w:asciiTheme="minorHAnsi" w:hAnsiTheme="minorHAnsi" w:cstheme="minorHAnsi"/>
-          <w:highlight w:val="yellow"/>
           <w:lang w:val="es-ES"/>
         </w:rPr>
         <w:t xml:space="preserve"> el usuario descarga un reporte de Montos,</w:t>
@@ -1903,7 +1788,6 @@
       <w:r>
         <w:rPr>
           <w:rFonts w:asciiTheme="minorHAnsi" w:hAnsiTheme="minorHAnsi" w:cstheme="minorHAnsi"/>
-          <w:highlight w:val="yellow"/>
           <w:lang w:val="es-ES"/>
         </w:rPr>
         <w:br/>
@@ -1913,7 +1797,6 @@
           <w:rFonts w:asciiTheme="minorHAnsi" w:hAnsiTheme="minorHAnsi" w:cstheme="minorHAnsi"/>
           <w:b/>
           <w:bCs/>
-          <w:highlight w:val="yellow"/>
           <w:lang w:val="es-ES"/>
         </w:rPr>
         <w:t>Cuando</w:t>
@@ -1921,7 +1804,6 @@
       <w:r>
         <w:rPr>
           <w:rFonts w:asciiTheme="minorHAnsi" w:hAnsiTheme="minorHAnsi" w:cstheme="minorHAnsi"/>
-          <w:highlight w:val="yellow"/>
           <w:lang w:val="es-ES"/>
         </w:rPr>
         <w:t xml:space="preserve"> se genere el archivo (Excel/PDF),</w:t>
@@ -1929,7 +1811,6 @@
       <w:r>
         <w:rPr>
           <w:rFonts w:asciiTheme="minorHAnsi" w:hAnsiTheme="minorHAnsi" w:cstheme="minorHAnsi"/>
-          <w:highlight w:val="yellow"/>
           <w:lang w:val="es-ES"/>
         </w:rPr>
         <w:br/>
@@ -1939,7 +1820,6 @@
           <w:rFonts w:asciiTheme="minorHAnsi" w:hAnsiTheme="minorHAnsi" w:cstheme="minorHAnsi"/>
           <w:b/>
           <w:bCs/>
-          <w:highlight w:val="yellow"/>
           <w:lang w:val="es-ES"/>
         </w:rPr>
         <w:t>Entonces</w:t>
@@ -1947,17 +1827,9 @@
       <w:r>
         <w:rPr>
           <w:rFonts w:asciiTheme="minorHAnsi" w:hAnsiTheme="minorHAnsi" w:cstheme="minorHAnsi"/>
-          <w:highlight w:val="yellow"/>
           <w:lang w:val="es-ES"/>
         </w:rPr>
-        <w:t xml:space="preserve"> el nombre del archivo deberá seguir un formato estandarizado que incluya el tipo de reporte, año y periodo específico (ej. "PPAFE_Montos_2024_Mensual_Enero.xlsx"</w:t>
-      </w:r>
-      <w:r>
-        <w:rPr>
-          <w:rFonts w:asciiTheme="minorHAnsi" w:hAnsiTheme="minorHAnsi" w:cstheme="minorHAnsi"/>
-          <w:lang w:val="es-ES"/>
-        </w:rPr>
-        <w:t>.</w:t>
+        <w:t xml:space="preserve"> el nombre del archivo deberá seguir un formato estandarizado que incluya el tipo de reporte, año y periodo específico (ej. "PPAFE_Montos_2024_Mensual_Enero.xlsx".</w:t>
       </w:r>
     </w:p>
     <w:p>
@@ -2418,7 +2290,6 @@
         <w:rPr>
           <w:rStyle w:val="Strong"/>
           <w:rFonts w:asciiTheme="minorHAnsi" w:hAnsiTheme="minorHAnsi" w:cstheme="minorHAnsi"/>
-          <w:highlight w:val="yellow"/>
         </w:rPr>
         <w:t>Criterio 3 - Filtros Disponibles (Tipo de Documento):</w:t>
       </w:r>
@@ -2426,7 +2297,6 @@
         <w:rPr>
           <w:rStyle w:val="Strong"/>
           <w:rFonts w:asciiTheme="minorHAnsi" w:hAnsiTheme="minorHAnsi" w:cstheme="minorHAnsi"/>
-          <w:highlight w:val="yellow"/>
         </w:rPr>
         <w:br/>
         <w:t xml:space="preserve">Dado que </w:t>
@@ -2437,7 +2307,6 @@
           <w:rFonts w:asciiTheme="minorHAnsi" w:hAnsiTheme="minorHAnsi" w:cstheme="minorHAnsi"/>
           <w:b w:val="0"/>
           <w:bCs w:val="0"/>
-          <w:highlight w:val="yellow"/>
         </w:rPr>
         <w:t>para Participaciones Federales existen tipos específicos de publicación de Acuerdos,</w:t>
       </w:r>
@@ -2445,7 +2314,6 @@
         <w:rPr>
           <w:rStyle w:val="Strong"/>
           <w:rFonts w:asciiTheme="minorHAnsi" w:hAnsiTheme="minorHAnsi" w:cstheme="minorHAnsi"/>
-          <w:highlight w:val="yellow"/>
         </w:rPr>
         <w:br/>
         <w:t xml:space="preserve">Cuando </w:t>
@@ -2456,7 +2324,6 @@
           <w:rFonts w:asciiTheme="minorHAnsi" w:hAnsiTheme="minorHAnsi" w:cstheme="minorHAnsi"/>
           <w:b w:val="0"/>
           <w:bCs w:val="0"/>
-          <w:highlight w:val="yellow"/>
         </w:rPr>
         <w:t>el usuario acceda a la sección de Acuerdos de Participaciones Federales,</w:t>
       </w:r>
@@ -2466,7 +2333,6 @@
           <w:rFonts w:asciiTheme="minorHAnsi" w:hAnsiTheme="minorHAnsi" w:cstheme="minorHAnsi"/>
           <w:b w:val="0"/>
           <w:bCs w:val="0"/>
-          <w:highlight w:val="yellow"/>
         </w:rPr>
         <w:br/>
       </w:r>
@@ -2474,7 +2340,6 @@
         <w:rPr>
           <w:rStyle w:val="Strong"/>
           <w:rFonts w:asciiTheme="minorHAnsi" w:hAnsiTheme="minorHAnsi" w:cstheme="minorHAnsi"/>
-          <w:highlight w:val="yellow"/>
         </w:rPr>
         <w:t xml:space="preserve">Entonces </w:t>
       </w:r>
@@ -2484,7 +2349,6 @@
           <w:rFonts w:asciiTheme="minorHAnsi" w:hAnsiTheme="minorHAnsi" w:cstheme="minorHAnsi"/>
           <w:b w:val="0"/>
           <w:bCs w:val="0"/>
-          <w:highlight w:val="yellow"/>
         </w:rPr>
         <w:t>deberá contar con un filtro adicional por "Tipo de Documento" que permita seleccionar entre las siguientes opciones específicas: "Trimestre 1", "Trimestre 2", "Trimestre 3", "Trimestre 4", "Estimación", "Ajuste Semestral", "Ajuste Anual".  Al presionar un botón "Filtrar", se actualizarán los resultados.</w:t>
       </w:r>
@@ -2502,7 +2366,6 @@
         <w:rPr>
           <w:rStyle w:val="Strong"/>
           <w:rFonts w:asciiTheme="minorHAnsi" w:hAnsiTheme="minorHAnsi" w:cstheme="minorHAnsi"/>
-          <w:highlight w:val="yellow"/>
         </w:rPr>
         <w:t>Criterio 4 - Visualización de Acuerdos Disponibles:</w:t>
       </w:r>
@@ -2510,7 +2373,6 @@
         <w:rPr>
           <w:rStyle w:val="Strong"/>
           <w:rFonts w:asciiTheme="minorHAnsi" w:hAnsiTheme="minorHAnsi" w:cstheme="minorHAnsi"/>
-          <w:highlight w:val="yellow"/>
         </w:rPr>
         <w:br/>
         <w:t xml:space="preserve">Dado que </w:t>
@@ -2521,7 +2383,6 @@
           <w:rFonts w:asciiTheme="minorHAnsi" w:hAnsiTheme="minorHAnsi" w:cstheme="minorHAnsi"/>
           <w:b w:val="0"/>
           <w:bCs w:val="0"/>
-          <w:highlight w:val="yellow"/>
         </w:rPr>
         <w:t>los acuerdos deben presentarse de forma clara,</w:t>
       </w:r>
@@ -2531,7 +2392,6 @@
           <w:rFonts w:asciiTheme="minorHAnsi" w:hAnsiTheme="minorHAnsi" w:cstheme="minorHAnsi"/>
           <w:b w:val="0"/>
           <w:bCs w:val="0"/>
-          <w:highlight w:val="yellow"/>
         </w:rPr>
         <w:br/>
       </w:r>
@@ -2539,7 +2399,6 @@
         <w:rPr>
           <w:rStyle w:val="Strong"/>
           <w:rFonts w:asciiTheme="minorHAnsi" w:hAnsiTheme="minorHAnsi" w:cstheme="minorHAnsi"/>
-          <w:highlight w:val="yellow"/>
         </w:rPr>
         <w:t>Cuando</w:t>
       </w:r>
@@ -2549,7 +2408,6 @@
           <w:rFonts w:asciiTheme="minorHAnsi" w:hAnsiTheme="minorHAnsi" w:cstheme="minorHAnsi"/>
           <w:b w:val="0"/>
           <w:bCs w:val="0"/>
-          <w:highlight w:val="yellow"/>
         </w:rPr>
         <w:t xml:space="preserve"> el usuario aplique los filtros o acceda a la sección,</w:t>
       </w:r>
@@ -2559,7 +2417,6 @@
           <w:rFonts w:asciiTheme="minorHAnsi" w:hAnsiTheme="minorHAnsi" w:cstheme="minorHAnsi"/>
           <w:b w:val="0"/>
           <w:bCs w:val="0"/>
-          <w:highlight w:val="yellow"/>
         </w:rPr>
         <w:br/>
       </w:r>
@@ -2567,7 +2424,6 @@
         <w:rPr>
           <w:rStyle w:val="Strong"/>
           <w:rFonts w:asciiTheme="minorHAnsi" w:hAnsiTheme="minorHAnsi" w:cstheme="minorHAnsi"/>
-          <w:highlight w:val="yellow"/>
         </w:rPr>
         <w:t>Entonces</w:t>
       </w:r>
@@ -2577,7 +2433,6 @@
           <w:rFonts w:asciiTheme="minorHAnsi" w:hAnsiTheme="minorHAnsi" w:cstheme="minorHAnsi"/>
           <w:b w:val="0"/>
           <w:bCs w:val="0"/>
-          <w:highlight w:val="yellow"/>
         </w:rPr>
         <w:t xml:space="preserve"> deberá visualizarse una lista de documentos (con vista previa si aplica, título y año) correspondientes a los filtros seleccionados.</w:t>
       </w:r>
@@ -2596,7 +2451,6 @@
           <w:rFonts w:asciiTheme="minorHAnsi" w:hAnsiTheme="minorHAnsi" w:cstheme="minorHAnsi"/>
           <w:b/>
           <w:bCs/>
-          <w:highlight w:val="yellow"/>
         </w:rPr>
         <w:t>Criterio 5 - Formatos de Archivo para Descarga</w:t>
       </w:r>
@@ -2605,7 +2459,6 @@
           <w:rFonts w:asciiTheme="minorHAnsi" w:hAnsiTheme="minorHAnsi" w:cstheme="minorHAnsi"/>
           <w:b/>
           <w:bCs/>
-          <w:highlight w:val="yellow"/>
         </w:rPr>
         <w:br/>
         <w:t>Dado que</w:t>
@@ -2613,7 +2466,6 @@
       <w:r>
         <w:rPr>
           <w:rFonts w:asciiTheme="minorHAnsi" w:hAnsiTheme="minorHAnsi" w:cstheme="minorHAnsi"/>
-          <w:highlight w:val="yellow"/>
         </w:rPr>
         <w:t xml:space="preserve"> en el sistema Admin se pueden cargar diferentes tipos de archivo,</w:t>
       </w:r>
@@ -2622,7 +2474,6 @@
           <w:rFonts w:asciiTheme="minorHAnsi" w:hAnsiTheme="minorHAnsi" w:cstheme="minorHAnsi"/>
           <w:b/>
           <w:bCs/>
-          <w:highlight w:val="yellow"/>
         </w:rPr>
         <w:br/>
         <w:t>Cuando</w:t>
@@ -2630,7 +2481,6 @@
       <w:r>
         <w:rPr>
           <w:rFonts w:asciiTheme="minorHAnsi" w:hAnsiTheme="minorHAnsi" w:cstheme="minorHAnsi"/>
-          <w:highlight w:val="yellow"/>
         </w:rPr>
         <w:t xml:space="preserve"> el visitante descargue un documento de Acuerdo desde el Portal,</w:t>
       </w:r>
@@ -2639,7 +2489,6 @@
           <w:rFonts w:asciiTheme="minorHAnsi" w:hAnsiTheme="minorHAnsi" w:cstheme="minorHAnsi"/>
           <w:b/>
           <w:bCs/>
-          <w:highlight w:val="yellow"/>
         </w:rPr>
         <w:br/>
         <w:t>Entonces</w:t>
@@ -2647,14 +2496,12 @@
       <w:r>
         <w:rPr>
           <w:rFonts w:asciiTheme="minorHAnsi" w:hAnsiTheme="minorHAnsi" w:cstheme="minorHAnsi"/>
-          <w:highlight w:val="yellow"/>
         </w:rPr>
         <w:t xml:space="preserve"> el formato del archivo descargado deberá corresponder al formato original que fue </w:t>
       </w:r>
       <w:r>
         <w:rPr>
           <w:rFonts w:asciiTheme="minorHAnsi" w:hAnsiTheme="minorHAnsi" w:cstheme="minorHAnsi"/>
-          <w:highlight w:val="yellow"/>
         </w:rPr>
         <w:lastRenderedPageBreak/>
         <w:t>cargado y aprobado en el sistema Admin (ej. si se subió un PDF, se descarga un PDF; si se subió un XLSX, se descarga un XLSX).</w:t>
@@ -3299,7 +3146,6 @@
         <w:pStyle w:val="NormalWeb"/>
         <w:rPr>
           <w:rFonts w:asciiTheme="minorHAnsi" w:hAnsiTheme="minorHAnsi" w:cstheme="minorHAnsi"/>
-          <w:highlight w:val="yellow"/>
         </w:rPr>
       </w:pPr>
       <w:r>
@@ -3307,7 +3153,6 @@
           <w:rFonts w:asciiTheme="minorHAnsi" w:hAnsiTheme="minorHAnsi" w:cstheme="minorHAnsi"/>
           <w:b/>
           <w:bCs/>
-          <w:highlight w:val="yellow"/>
         </w:rPr>
         <w:lastRenderedPageBreak/>
         <w:t>HU0</w:t>
@@ -3317,7 +3162,6 @@
           <w:rFonts w:asciiTheme="minorHAnsi" w:hAnsiTheme="minorHAnsi" w:cstheme="minorHAnsi"/>
           <w:b/>
           <w:bCs/>
-          <w:highlight w:val="yellow"/>
           <w:lang w:val="es-ES"/>
         </w:rPr>
         <w:t>5</w:t>
@@ -3327,7 +3171,6 @@
           <w:rFonts w:asciiTheme="minorHAnsi" w:hAnsiTheme="minorHAnsi" w:cstheme="minorHAnsi"/>
           <w:b/>
           <w:bCs/>
-          <w:highlight w:val="yellow"/>
         </w:rPr>
         <w:t xml:space="preserve"> Portal PPAFE - Visualización de Convenios (Incentivos)</w:t>
       </w:r>
@@ -3336,7 +3179,6 @@
           <w:rFonts w:asciiTheme="minorHAnsi" w:hAnsiTheme="minorHAnsi" w:cstheme="minorHAnsi"/>
           <w:b/>
           <w:bCs/>
-          <w:highlight w:val="yellow"/>
         </w:rPr>
         <w:br/>
         <w:t>Como</w:t>
@@ -3344,14 +3186,12 @@
       <w:r>
         <w:rPr>
           <w:rFonts w:asciiTheme="minorHAnsi" w:hAnsiTheme="minorHAnsi" w:cstheme="minorHAnsi"/>
-          <w:highlight w:val="yellow"/>
         </w:rPr>
         <w:t xml:space="preserve"> visitante del Portal Público del sistema PPAFE,</w:t>
       </w:r>
       <w:r>
         <w:rPr>
           <w:rFonts w:asciiTheme="minorHAnsi" w:hAnsiTheme="minorHAnsi" w:cstheme="minorHAnsi"/>
-          <w:highlight w:val="yellow"/>
         </w:rPr>
         <w:br/>
       </w:r>
@@ -3360,21 +3200,18 @@
           <w:rFonts w:asciiTheme="minorHAnsi" w:hAnsiTheme="minorHAnsi" w:cstheme="minorHAnsi"/>
           <w:b/>
           <w:bCs/>
-          <w:highlight w:val="yellow"/>
         </w:rPr>
         <w:t>Quiero</w:t>
       </w:r>
       <w:r>
         <w:rPr>
           <w:rFonts w:asciiTheme="minorHAnsi" w:hAnsiTheme="minorHAnsi" w:cstheme="minorHAnsi"/>
-          <w:highlight w:val="yellow"/>
         </w:rPr>
         <w:t xml:space="preserve"> poder consultar la información publicada sobre Convenios (Incentivos), si esta se encuentra disponible públicamente,</w:t>
       </w:r>
       <w:r>
         <w:rPr>
           <w:rFonts w:asciiTheme="minorHAnsi" w:hAnsiTheme="minorHAnsi" w:cstheme="minorHAnsi"/>
-          <w:highlight w:val="yellow"/>
         </w:rPr>
         <w:br/>
       </w:r>
@@ -3383,14 +3220,12 @@
           <w:rFonts w:asciiTheme="minorHAnsi" w:hAnsiTheme="minorHAnsi" w:cstheme="minorHAnsi"/>
           <w:b/>
           <w:bCs/>
-          <w:highlight w:val="yellow"/>
         </w:rPr>
         <w:t>Para</w:t>
       </w:r>
       <w:r>
         <w:rPr>
           <w:rFonts w:asciiTheme="minorHAnsi" w:hAnsiTheme="minorHAnsi" w:cstheme="minorHAnsi"/>
-          <w:highlight w:val="yellow"/>
         </w:rPr>
         <w:t xml:space="preserve"> conocer los detalles y documentos relacionados con estos acuerdos específicos.</w:t>
       </w:r>
@@ -3402,7 +3237,6 @@
           <w:rFonts w:asciiTheme="minorHAnsi" w:hAnsiTheme="minorHAnsi" w:cstheme="minorHAnsi"/>
           <w:b/>
           <w:bCs/>
-          <w:highlight w:val="yellow"/>
         </w:rPr>
       </w:pPr>
       <w:r>
@@ -3410,7 +3244,6 @@
           <w:rFonts w:asciiTheme="minorHAnsi" w:hAnsiTheme="minorHAnsi" w:cstheme="minorHAnsi"/>
           <w:b/>
           <w:bCs/>
-          <w:highlight w:val="yellow"/>
         </w:rPr>
         <w:t>Criterios de Aceptación</w:t>
       </w:r>
@@ -3422,7 +3255,6 @@
           <w:rFonts w:asciiTheme="minorHAnsi" w:hAnsiTheme="minorHAnsi" w:cstheme="minorHAnsi"/>
           <w:b/>
           <w:bCs/>
-          <w:highlight w:val="yellow"/>
           <w:lang w:val="es-ES"/>
         </w:rPr>
       </w:pPr>
@@ -3431,7 +3263,6 @@
           <w:rFonts w:asciiTheme="minorHAnsi" w:hAnsiTheme="minorHAnsi" w:cstheme="minorHAnsi"/>
           <w:b/>
           <w:bCs/>
-          <w:highlight w:val="yellow"/>
         </w:rPr>
         <w:t>Criterio 1 - Acceso Condicionado por Configuración Admin:</w:t>
       </w:r>
@@ -3440,7 +3271,6 @@
           <w:rFonts w:asciiTheme="minorHAnsi" w:hAnsiTheme="minorHAnsi" w:cstheme="minorHAnsi"/>
           <w:b/>
           <w:bCs/>
-          <w:highlight w:val="yellow"/>
         </w:rPr>
         <w:br/>
         <w:t>Dado que</w:t>
@@ -3448,7 +3278,6 @@
       <w:r>
         <w:rPr>
           <w:rFonts w:asciiTheme="minorHAnsi" w:hAnsiTheme="minorHAnsi" w:cstheme="minorHAnsi"/>
-          <w:highlight w:val="yellow"/>
         </w:rPr>
         <w:t xml:space="preserve"> la visibilidad pública de la sección de Convenios es controlada centralmente (según HU22 Admin),</w:t>
       </w:r>
@@ -3457,7 +3286,6 @@
           <w:rFonts w:asciiTheme="minorHAnsi" w:hAnsiTheme="minorHAnsi" w:cstheme="minorHAnsi"/>
           <w:b/>
           <w:bCs/>
-          <w:highlight w:val="yellow"/>
         </w:rPr>
         <w:br/>
         <w:t>Cuando</w:t>
@@ -3465,7 +3293,6 @@
       <w:r>
         <w:rPr>
           <w:rFonts w:asciiTheme="minorHAnsi" w:hAnsiTheme="minorHAnsi" w:cstheme="minorHAnsi"/>
-          <w:highlight w:val="yellow"/>
         </w:rPr>
         <w:t xml:space="preserve"> el visitante navegue por el Portal Público,</w:t>
       </w:r>
@@ -3474,7 +3301,6 @@
           <w:rFonts w:asciiTheme="minorHAnsi" w:hAnsiTheme="minorHAnsi" w:cstheme="minorHAnsi"/>
           <w:b/>
           <w:bCs/>
-          <w:highlight w:val="yellow"/>
         </w:rPr>
         <w:br/>
         <w:t>Entonces</w:t>
@@ -3482,7 +3308,6 @@
       <w:r>
         <w:rPr>
           <w:rFonts w:asciiTheme="minorHAnsi" w:hAnsiTheme="minorHAnsi" w:cstheme="minorHAnsi"/>
-          <w:highlight w:val="yellow"/>
         </w:rPr>
         <w:t xml:space="preserve"> la opción para acceder a la sección de "Convenios" (ej. un botón en la página principal o una opción de menú) solo deberá ser visible y activa si dicha sección ha sido habilitada para visualización pública en la configuración del sistema Admin. Si no está habilitada, la opción no debe aparecer o debe estar inactiva/reemplazada por un mensaje informativo.</w:t>
       </w:r>
@@ -3494,7 +3319,6 @@
           <w:rFonts w:asciiTheme="minorHAnsi" w:hAnsiTheme="minorHAnsi" w:cstheme="minorHAnsi"/>
           <w:b/>
           <w:bCs/>
-          <w:highlight w:val="yellow"/>
         </w:rPr>
       </w:pPr>
       <w:r>
@@ -3502,7 +3326,6 @@
           <w:rFonts w:asciiTheme="minorHAnsi" w:hAnsiTheme="minorHAnsi" w:cstheme="minorHAnsi"/>
           <w:b/>
           <w:bCs/>
-          <w:highlight w:val="yellow"/>
         </w:rPr>
         <w:t>Criterio 2 - Visualización del Listado (si aplica):</w:t>
       </w:r>
@@ -3511,7 +3334,6 @@
           <w:rFonts w:asciiTheme="minorHAnsi" w:hAnsiTheme="minorHAnsi" w:cstheme="minorHAnsi"/>
           <w:b/>
           <w:bCs/>
-          <w:highlight w:val="yellow"/>
         </w:rPr>
         <w:br/>
         <w:t>Dado que</w:t>
@@ -3519,7 +3341,6 @@
       <w:r>
         <w:rPr>
           <w:rFonts w:asciiTheme="minorHAnsi" w:hAnsiTheme="minorHAnsi" w:cstheme="minorHAnsi"/>
-          <w:highlight w:val="yellow"/>
         </w:rPr>
         <w:t xml:space="preserve"> la sección de Convenios está habilitada públicamente y existen registros marcados como "Publicado" en el Admin,</w:t>
       </w:r>
@@ -3528,7 +3349,6 @@
           <w:rFonts w:asciiTheme="minorHAnsi" w:hAnsiTheme="minorHAnsi" w:cstheme="minorHAnsi"/>
           <w:b/>
           <w:bCs/>
-          <w:highlight w:val="yellow"/>
         </w:rPr>
         <w:br/>
         <w:t>Cuando</w:t>
@@ -3536,7 +3356,6 @@
       <w:r>
         <w:rPr>
           <w:rFonts w:asciiTheme="minorHAnsi" w:hAnsiTheme="minorHAnsi" w:cstheme="minorHAnsi"/>
-          <w:highlight w:val="yellow"/>
         </w:rPr>
         <w:t xml:space="preserve"> el visitante acceda a la sección de Convenios,</w:t>
       </w:r>
@@ -3545,7 +3364,6 @@
           <w:rFonts w:asciiTheme="minorHAnsi" w:hAnsiTheme="minorHAnsi" w:cstheme="minorHAnsi"/>
           <w:b/>
           <w:bCs/>
-          <w:highlight w:val="yellow"/>
         </w:rPr>
         <w:br/>
         <w:t>Entonces</w:t>
@@ -3553,7 +3371,6 @@
       <w:r>
         <w:rPr>
           <w:rFonts w:asciiTheme="minorHAnsi" w:hAnsiTheme="minorHAnsi" w:cstheme="minorHAnsi"/>
-          <w:highlight w:val="yellow"/>
         </w:rPr>
         <w:t xml:space="preserve"> deberá visualizar un listado claro de los convenios disponibles, mostrando información identificativa como Título (o nombre del convenio) y Fecha/Año.</w:t>
       </w:r>
@@ -3565,7 +3382,6 @@
           <w:rFonts w:asciiTheme="minorHAnsi" w:hAnsiTheme="minorHAnsi" w:cstheme="minorHAnsi"/>
           <w:b/>
           <w:bCs/>
-          <w:highlight w:val="yellow"/>
         </w:rPr>
       </w:pPr>
       <w:r>
@@ -3573,7 +3389,6 @@
           <w:rFonts w:asciiTheme="minorHAnsi" w:hAnsiTheme="minorHAnsi" w:cstheme="minorHAnsi"/>
           <w:b/>
           <w:bCs/>
-          <w:highlight w:val="yellow"/>
         </w:rPr>
         <w:t>Criterio 3 - Filtros (Opcional, si aplica):</w:t>
       </w:r>
@@ -3582,7 +3397,6 @@
           <w:rFonts w:asciiTheme="minorHAnsi" w:hAnsiTheme="minorHAnsi" w:cstheme="minorHAnsi"/>
           <w:b/>
           <w:bCs/>
-          <w:highlight w:val="yellow"/>
         </w:rPr>
         <w:br/>
         <w:t>Dado que</w:t>
@@ -3590,7 +3404,6 @@
       <w:r>
         <w:rPr>
           <w:rFonts w:asciiTheme="minorHAnsi" w:hAnsiTheme="minorHAnsi" w:cstheme="minorHAnsi"/>
-          <w:highlight w:val="yellow"/>
         </w:rPr>
         <w:t xml:space="preserve"> la cantidad de convenios puede crecer,</w:t>
       </w:r>
@@ -3599,7 +3412,6 @@
           <w:rFonts w:asciiTheme="minorHAnsi" w:hAnsiTheme="minorHAnsi" w:cstheme="minorHAnsi"/>
           <w:b/>
           <w:bCs/>
-          <w:highlight w:val="yellow"/>
         </w:rPr>
         <w:br/>
         <w:t>Cuando</w:t>
@@ -3607,7 +3419,6 @@
       <w:r>
         <w:rPr>
           <w:rFonts w:asciiTheme="minorHAnsi" w:hAnsiTheme="minorHAnsi" w:cstheme="minorHAnsi"/>
-          <w:highlight w:val="yellow"/>
         </w:rPr>
         <w:t xml:space="preserve"> el visitante vea el listado de convenios,</w:t>
       </w:r>
@@ -3616,7 +3427,6 @@
           <w:rFonts w:asciiTheme="minorHAnsi" w:hAnsiTheme="minorHAnsi" w:cstheme="minorHAnsi"/>
           <w:b/>
           <w:bCs/>
-          <w:highlight w:val="yellow"/>
         </w:rPr>
         <w:br/>
         <w:t>Entonces</w:t>
@@ -3624,7 +3434,6 @@
       <w:r>
         <w:rPr>
           <w:rFonts w:asciiTheme="minorHAnsi" w:hAnsiTheme="minorHAnsi" w:cstheme="minorHAnsi"/>
-          <w:highlight w:val="yellow"/>
         </w:rPr>
         <w:t xml:space="preserve"> podría contar con filtros básicos (ej. por Año, por tipo de convenio si aplica) para refinar la búsqueda y encontrar información específica más fácilmente.</w:t>
       </w:r>
@@ -3643,7 +3452,6 @@
           <w:rFonts w:asciiTheme="minorHAnsi" w:hAnsiTheme="minorHAnsi" w:cstheme="minorHAnsi"/>
           <w:b/>
           <w:bCs/>
-          <w:highlight w:val="yellow"/>
         </w:rPr>
         <w:t>Criterio 4 - Descarga de Documentos Asociados:</w:t>
       </w:r>
@@ -3652,7 +3460,6 @@
           <w:rFonts w:asciiTheme="minorHAnsi" w:hAnsiTheme="minorHAnsi" w:cstheme="minorHAnsi"/>
           <w:b/>
           <w:bCs/>
-          <w:highlight w:val="yellow"/>
         </w:rPr>
         <w:br/>
         <w:t>Dado que</w:t>
@@ -3660,7 +3467,6 @@
       <w:r>
         <w:rPr>
           <w:rFonts w:asciiTheme="minorHAnsi" w:hAnsiTheme="minorHAnsi" w:cstheme="minorHAnsi"/>
-          <w:highlight w:val="yellow"/>
         </w:rPr>
         <w:t xml:space="preserve"> se requiere consultar el detalle completo del convenio,</w:t>
       </w:r>
@@ -3669,7 +3475,6 @@
           <w:rFonts w:asciiTheme="minorHAnsi" w:hAnsiTheme="minorHAnsi" w:cstheme="minorHAnsi"/>
           <w:b/>
           <w:bCs/>
-          <w:highlight w:val="yellow"/>
         </w:rPr>
         <w:br/>
         <w:t>Cuando</w:t>
@@ -3677,7 +3482,6 @@
       <w:r>
         <w:rPr>
           <w:rFonts w:asciiTheme="minorHAnsi" w:hAnsiTheme="minorHAnsi" w:cstheme="minorHAnsi"/>
-          <w:highlight w:val="yellow"/>
         </w:rPr>
         <w:t xml:space="preserve"> el visitante seleccione un convenio específico del listado,</w:t>
       </w:r>
@@ -3686,7 +3490,6 @@
           <w:rFonts w:asciiTheme="minorHAnsi" w:hAnsiTheme="minorHAnsi" w:cstheme="minorHAnsi"/>
           <w:b/>
           <w:bCs/>
-          <w:highlight w:val="yellow"/>
         </w:rPr>
         <w:br/>
         <w:t>Entonces</w:t>
@@ -3694,7 +3497,6 @@
       <w:r>
         <w:rPr>
           <w:rFonts w:asciiTheme="minorHAnsi" w:hAnsiTheme="minorHAnsi" w:cstheme="minorHAnsi"/>
-          <w:highlight w:val="yellow"/>
         </w:rPr>
         <w:t xml:space="preserve"> deberá tener la opción de descargar el archivo o los archivos asociados a ese convenio, en su formato original (el tipo de archivo dependerá de lo definido en HU28 Admin, ej. PDF, XLSX).</w:t>
       </w:r>
@@ -3744,7 +3546,6 @@
           <w:rFonts w:asciiTheme="minorHAnsi" w:hAnsiTheme="minorHAnsi" w:cstheme="minorHAnsi"/>
           <w:b/>
           <w:bCs/>
-          <w:highlight w:val="yellow"/>
         </w:rPr>
       </w:pPr>
       <w:r>
@@ -3752,7 +3553,6 @@
           <w:rFonts w:asciiTheme="minorHAnsi" w:hAnsiTheme="minorHAnsi" w:cstheme="minorHAnsi"/>
           <w:b/>
           <w:bCs/>
-          <w:highlight w:val="yellow"/>
         </w:rPr>
         <w:t>HU0</w:t>
       </w:r>
@@ -3761,7 +3561,6 @@
           <w:rFonts w:asciiTheme="minorHAnsi" w:hAnsiTheme="minorHAnsi" w:cstheme="minorHAnsi"/>
           <w:b/>
           <w:bCs/>
-          <w:highlight w:val="yellow"/>
           <w:lang w:val="es-ES"/>
         </w:rPr>
         <w:t>6</w:t>
@@ -3771,7 +3570,6 @@
           <w:rFonts w:asciiTheme="minorHAnsi" w:hAnsiTheme="minorHAnsi" w:cstheme="minorHAnsi"/>
           <w:b/>
           <w:bCs/>
-          <w:highlight w:val="yellow"/>
         </w:rPr>
         <w:t xml:space="preserve"> Portal PPAFE - Visualización y Acceso a Redes Sociales</w:t>
       </w:r>
@@ -3780,7 +3578,6 @@
       <w:pPr>
         <w:rPr>
           <w:rFonts w:asciiTheme="minorHAnsi" w:hAnsiTheme="minorHAnsi" w:cstheme="minorHAnsi"/>
-          <w:highlight w:val="yellow"/>
         </w:rPr>
       </w:pPr>
       <w:r>
@@ -3788,14 +3585,12 @@
           <w:rFonts w:asciiTheme="minorHAnsi" w:hAnsiTheme="minorHAnsi" w:cstheme="minorHAnsi"/>
           <w:b/>
           <w:bCs/>
-          <w:highlight w:val="yellow"/>
         </w:rPr>
         <w:t>Como</w:t>
       </w:r>
       <w:r>
         <w:rPr>
           <w:rFonts w:asciiTheme="minorHAnsi" w:hAnsiTheme="minorHAnsi" w:cstheme="minorHAnsi"/>
-          <w:highlight w:val="yellow"/>
         </w:rPr>
         <w:t xml:space="preserve"> visitante del Portal Público del sistema PPAFE,</w:t>
       </w:r>
@@ -3804,7 +3599,6 @@
       <w:pPr>
         <w:rPr>
           <w:rFonts w:asciiTheme="minorHAnsi" w:hAnsiTheme="minorHAnsi" w:cstheme="minorHAnsi"/>
-          <w:highlight w:val="yellow"/>
         </w:rPr>
       </w:pPr>
       <w:r>
@@ -3812,14 +3606,12 @@
           <w:rFonts w:asciiTheme="minorHAnsi" w:hAnsiTheme="minorHAnsi" w:cstheme="minorHAnsi"/>
           <w:b/>
           <w:bCs/>
-          <w:highlight w:val="yellow"/>
         </w:rPr>
         <w:t>Quiero</w:t>
       </w:r>
       <w:r>
         <w:rPr>
           <w:rFonts w:asciiTheme="minorHAnsi" w:hAnsiTheme="minorHAnsi" w:cstheme="minorHAnsi"/>
-          <w:highlight w:val="yellow"/>
         </w:rPr>
         <w:t xml:space="preserve"> ver los iconos de las redes sociales oficiales de la institución en un lugar visible del portal (ej. pie de página) y poder hacer clic en ellos para visitar dichas redes,</w:t>
       </w:r>
@@ -3828,7 +3620,6 @@
       <w:pPr>
         <w:rPr>
           <w:rFonts w:asciiTheme="minorHAnsi" w:hAnsiTheme="minorHAnsi" w:cstheme="minorHAnsi"/>
-          <w:highlight w:val="yellow"/>
         </w:rPr>
       </w:pPr>
       <w:r>
@@ -3836,14 +3627,12 @@
           <w:rFonts w:asciiTheme="minorHAnsi" w:hAnsiTheme="minorHAnsi" w:cstheme="minorHAnsi"/>
           <w:b/>
           <w:bCs/>
-          <w:highlight w:val="yellow"/>
         </w:rPr>
         <w:t>Para</w:t>
       </w:r>
       <w:r>
         <w:rPr>
           <w:rFonts w:asciiTheme="minorHAnsi" w:hAnsiTheme="minorHAnsi" w:cstheme="minorHAnsi"/>
-          <w:highlight w:val="yellow"/>
         </w:rPr>
         <w:t xml:space="preserve"> poder seguir las actualizaciones de la institución o interactuar a través de esos canales oficiales.</w:t>
       </w:r>
@@ -3852,7 +3641,6 @@
       <w:pPr>
         <w:rPr>
           <w:rFonts w:asciiTheme="minorHAnsi" w:hAnsiTheme="minorHAnsi" w:cstheme="minorHAnsi"/>
-          <w:highlight w:val="yellow"/>
         </w:rPr>
       </w:pPr>
     </w:p>
@@ -3862,7 +3650,6 @@
           <w:rFonts w:asciiTheme="minorHAnsi" w:hAnsiTheme="minorHAnsi" w:cstheme="minorHAnsi"/>
           <w:b/>
           <w:bCs/>
-          <w:highlight w:val="yellow"/>
         </w:rPr>
       </w:pPr>
       <w:r>
@@ -3870,7 +3657,6 @@
           <w:rFonts w:asciiTheme="minorHAnsi" w:hAnsiTheme="minorHAnsi" w:cstheme="minorHAnsi"/>
           <w:b/>
           <w:bCs/>
-          <w:highlight w:val="yellow"/>
         </w:rPr>
         <w:t>Criterios de Aceptación</w:t>
       </w:r>
@@ -3879,7 +3665,6 @@
       <w:pPr>
         <w:rPr>
           <w:rFonts w:asciiTheme="minorHAnsi" w:hAnsiTheme="minorHAnsi" w:cstheme="minorHAnsi"/>
-          <w:highlight w:val="yellow"/>
         </w:rPr>
       </w:pPr>
     </w:p>
@@ -3889,7 +3674,6 @@
           <w:rFonts w:asciiTheme="minorHAnsi" w:hAnsiTheme="minorHAnsi" w:cstheme="minorHAnsi"/>
           <w:b/>
           <w:bCs/>
-          <w:highlight w:val="yellow"/>
         </w:rPr>
       </w:pPr>
       <w:r>
@@ -3897,7 +3681,6 @@
           <w:rFonts w:asciiTheme="minorHAnsi" w:hAnsiTheme="minorHAnsi" w:cstheme="minorHAnsi"/>
           <w:b/>
           <w:bCs/>
-          <w:highlight w:val="yellow"/>
         </w:rPr>
         <w:t>Criterio 1 - Despliegue Dinámico de Iconos Configurados:</w:t>
       </w:r>
@@ -3906,7 +3689,6 @@
       <w:pPr>
         <w:rPr>
           <w:rFonts w:asciiTheme="minorHAnsi" w:hAnsiTheme="minorHAnsi" w:cstheme="minorHAnsi"/>
-          <w:highlight w:val="yellow"/>
         </w:rPr>
       </w:pPr>
       <w:r>
@@ -3914,14 +3696,12 @@
           <w:rFonts w:asciiTheme="minorHAnsi" w:hAnsiTheme="minorHAnsi" w:cstheme="minorHAnsi"/>
           <w:b/>
           <w:bCs/>
-          <w:highlight w:val="yellow"/>
         </w:rPr>
         <w:t>Dado que</w:t>
       </w:r>
       <w:r>
         <w:rPr>
           <w:rFonts w:asciiTheme="minorHAnsi" w:hAnsiTheme="minorHAnsi" w:cstheme="minorHAnsi"/>
-          <w:highlight w:val="yellow"/>
         </w:rPr>
         <w:t xml:space="preserve"> las URLs de las redes sociales se configuran en el Admin (según HU31 Admin),</w:t>
       </w:r>
@@ -3930,7 +3710,6 @@
       <w:pPr>
         <w:rPr>
           <w:rFonts w:asciiTheme="minorHAnsi" w:hAnsiTheme="minorHAnsi" w:cstheme="minorHAnsi"/>
-          <w:highlight w:val="yellow"/>
         </w:rPr>
       </w:pPr>
       <w:r>
@@ -3938,14 +3717,12 @@
           <w:rFonts w:asciiTheme="minorHAnsi" w:hAnsiTheme="minorHAnsi" w:cstheme="minorHAnsi"/>
           <w:b/>
           <w:bCs/>
-          <w:highlight w:val="yellow"/>
         </w:rPr>
         <w:t>Cuando</w:t>
       </w:r>
       <w:r>
         <w:rPr>
           <w:rFonts w:asciiTheme="minorHAnsi" w:hAnsiTheme="minorHAnsi" w:cstheme="minorHAnsi"/>
-          <w:highlight w:val="yellow"/>
         </w:rPr>
         <w:t xml:space="preserve"> el visitante cargue cualquier página del Portal Público,</w:t>
       </w:r>
@@ -3954,7 +3731,6 @@
       <w:pPr>
         <w:rPr>
           <w:rFonts w:asciiTheme="minorHAnsi" w:hAnsiTheme="minorHAnsi" w:cstheme="minorHAnsi"/>
-          <w:highlight w:val="yellow"/>
         </w:rPr>
       </w:pPr>
       <w:r>
@@ -3962,14 +3738,12 @@
           <w:rFonts w:asciiTheme="minorHAnsi" w:hAnsiTheme="minorHAnsi" w:cstheme="minorHAnsi"/>
           <w:b/>
           <w:bCs/>
-          <w:highlight w:val="yellow"/>
         </w:rPr>
         <w:t>Entonces</w:t>
       </w:r>
       <w:r>
         <w:rPr>
           <w:rFonts w:asciiTheme="minorHAnsi" w:hAnsiTheme="minorHAnsi" w:cstheme="minorHAnsi"/>
-          <w:highlight w:val="yellow"/>
         </w:rPr>
         <w:t xml:space="preserve"> en la ubicación designada (ej. pie de página) deberán mostrarse dinámicamente los iconos correspondientes únicamente a aquellas redes sociales que tengan una URL válida configurada en el Admin. Si una red social no tiene URL configurada, su icono no debe aparecer.</w:t>
       </w:r>
@@ -3978,7 +3752,6 @@
       <w:pPr>
         <w:rPr>
           <w:rFonts w:asciiTheme="minorHAnsi" w:hAnsiTheme="minorHAnsi" w:cstheme="minorHAnsi"/>
-          <w:highlight w:val="yellow"/>
         </w:rPr>
       </w:pPr>
     </w:p>
@@ -3988,7 +3761,6 @@
           <w:rFonts w:asciiTheme="minorHAnsi" w:hAnsiTheme="minorHAnsi" w:cstheme="minorHAnsi"/>
           <w:b/>
           <w:bCs/>
-          <w:highlight w:val="yellow"/>
         </w:rPr>
       </w:pPr>
       <w:r>
@@ -3996,7 +3768,6 @@
           <w:rFonts w:asciiTheme="minorHAnsi" w:hAnsiTheme="minorHAnsi" w:cstheme="minorHAnsi"/>
           <w:b/>
           <w:bCs/>
-          <w:highlight w:val="yellow"/>
         </w:rPr>
         <w:t>Criterio 2 - Enlace Funcional a URL Correcta:</w:t>
       </w:r>
@@ -4005,7 +3776,6 @@
       <w:pPr>
         <w:rPr>
           <w:rFonts w:asciiTheme="minorHAnsi" w:hAnsiTheme="minorHAnsi" w:cstheme="minorHAnsi"/>
-          <w:highlight w:val="yellow"/>
         </w:rPr>
       </w:pPr>
       <w:r>
@@ -4013,14 +3783,12 @@
           <w:rFonts w:asciiTheme="minorHAnsi" w:hAnsiTheme="minorHAnsi" w:cstheme="minorHAnsi"/>
           <w:b/>
           <w:bCs/>
-          <w:highlight w:val="yellow"/>
         </w:rPr>
         <w:t>Dado que</w:t>
       </w:r>
       <w:r>
         <w:rPr>
           <w:rFonts w:asciiTheme="minorHAnsi" w:hAnsiTheme="minorHAnsi" w:cstheme="minorHAnsi"/>
-          <w:highlight w:val="yellow"/>
         </w:rPr>
         <w:t xml:space="preserve"> se muestran los iconos de las redes sociales configuradas,</w:t>
       </w:r>
@@ -4029,7 +3797,6 @@
       <w:pPr>
         <w:rPr>
           <w:rFonts w:asciiTheme="minorHAnsi" w:hAnsiTheme="minorHAnsi" w:cstheme="minorHAnsi"/>
-          <w:highlight w:val="yellow"/>
         </w:rPr>
       </w:pPr>
       <w:r>
@@ -4037,14 +3804,12 @@
           <w:rFonts w:asciiTheme="minorHAnsi" w:hAnsiTheme="minorHAnsi" w:cstheme="minorHAnsi"/>
           <w:b/>
           <w:bCs/>
-          <w:highlight w:val="yellow"/>
         </w:rPr>
         <w:t>Cuando</w:t>
       </w:r>
       <w:r>
         <w:rPr>
           <w:rFonts w:asciiTheme="minorHAnsi" w:hAnsiTheme="minorHAnsi" w:cstheme="minorHAnsi"/>
-          <w:highlight w:val="yellow"/>
         </w:rPr>
         <w:t xml:space="preserve"> el visitante haga clic en uno de los iconos visibles (ej. icono de Facebook),</w:t>
       </w:r>
@@ -4053,7 +3818,6 @@
       <w:pPr>
         <w:rPr>
           <w:rFonts w:asciiTheme="minorHAnsi" w:hAnsiTheme="minorHAnsi" w:cstheme="minorHAnsi"/>
-          <w:highlight w:val="yellow"/>
         </w:rPr>
       </w:pPr>
       <w:r>
@@ -4061,14 +3825,12 @@
           <w:rFonts w:asciiTheme="minorHAnsi" w:hAnsiTheme="minorHAnsi" w:cstheme="minorHAnsi"/>
           <w:b/>
           <w:bCs/>
-          <w:highlight w:val="yellow"/>
         </w:rPr>
         <w:t>Entonces</w:t>
       </w:r>
       <w:r>
         <w:rPr>
           <w:rFonts w:asciiTheme="minorHAnsi" w:hAnsiTheme="minorHAnsi" w:cstheme="minorHAnsi"/>
-          <w:highlight w:val="yellow"/>
         </w:rPr>
         <w:t xml:space="preserve"> se deberá abrir una nueva pestaña en su navegador web, dirigiéndolo a la URL exacta que fue configurada para esa red social específica (Facebook en el ejemplo) en el Admin (HU31).</w:t>
       </w:r>
@@ -4077,7 +3839,6 @@
       <w:pPr>
         <w:rPr>
           <w:rFonts w:asciiTheme="minorHAnsi" w:hAnsiTheme="minorHAnsi" w:cstheme="minorHAnsi"/>
-          <w:highlight w:val="yellow"/>
         </w:rPr>
       </w:pPr>
     </w:p>
@@ -4087,7 +3848,6 @@
           <w:rFonts w:asciiTheme="minorHAnsi" w:hAnsiTheme="minorHAnsi" w:cstheme="minorHAnsi"/>
           <w:b/>
           <w:bCs/>
-          <w:highlight w:val="yellow"/>
         </w:rPr>
       </w:pPr>
       <w:r>
@@ -4095,7 +3855,6 @@
           <w:rFonts w:asciiTheme="minorHAnsi" w:hAnsiTheme="minorHAnsi" w:cstheme="minorHAnsi"/>
           <w:b/>
           <w:bCs/>
-          <w:highlight w:val="yellow"/>
         </w:rPr>
         <w:t>Criterio 3 - Diseño Visual Consistente:</w:t>
       </w:r>
@@ -4104,7 +3863,6 @@
       <w:pPr>
         <w:rPr>
           <w:rFonts w:asciiTheme="minorHAnsi" w:hAnsiTheme="minorHAnsi" w:cstheme="minorHAnsi"/>
-          <w:highlight w:val="yellow"/>
         </w:rPr>
       </w:pPr>
       <w:r>
@@ -4112,14 +3870,12 @@
           <w:rFonts w:asciiTheme="minorHAnsi" w:hAnsiTheme="minorHAnsi" w:cstheme="minorHAnsi"/>
           <w:b/>
           <w:bCs/>
-          <w:highlight w:val="yellow"/>
         </w:rPr>
         <w:t>Dado que</w:t>
       </w:r>
       <w:r>
         <w:rPr>
           <w:rFonts w:asciiTheme="minorHAnsi" w:hAnsiTheme="minorHAnsi" w:cstheme="minorHAnsi"/>
-          <w:highlight w:val="yellow"/>
         </w:rPr>
         <w:t xml:space="preserve"> los iconos forman parte de la identidad visual del portal,</w:t>
       </w:r>
@@ -4128,7 +3884,6 @@
       <w:pPr>
         <w:rPr>
           <w:rFonts w:asciiTheme="minorHAnsi" w:hAnsiTheme="minorHAnsi" w:cstheme="minorHAnsi"/>
-          <w:highlight w:val="yellow"/>
         </w:rPr>
       </w:pPr>
       <w:r>
@@ -4136,14 +3891,12 @@
           <w:rFonts w:asciiTheme="minorHAnsi" w:hAnsiTheme="minorHAnsi" w:cstheme="minorHAnsi"/>
           <w:b/>
           <w:bCs/>
-          <w:highlight w:val="yellow"/>
         </w:rPr>
         <w:t>Cuando</w:t>
       </w:r>
       <w:r>
         <w:rPr>
           <w:rFonts w:asciiTheme="minorHAnsi" w:hAnsiTheme="minorHAnsi" w:cstheme="minorHAnsi"/>
-          <w:highlight w:val="yellow"/>
         </w:rPr>
         <w:t xml:space="preserve"> se muestren los iconos de redes sociales,</w:t>
       </w:r>
@@ -4159,14 +3912,12 @@
           <w:rFonts w:asciiTheme="minorHAnsi" w:hAnsiTheme="minorHAnsi" w:cstheme="minorHAnsi"/>
           <w:b/>
           <w:bCs/>
-          <w:highlight w:val="yellow"/>
         </w:rPr>
         <w:t>Entonces</w:t>
       </w:r>
       <w:r>
         <w:rPr>
           <w:rFonts w:asciiTheme="minorHAnsi" w:hAnsiTheme="minorHAnsi" w:cstheme="minorHAnsi"/>
-          <w:highlight w:val="yellow"/>
         </w:rPr>
         <w:t xml:space="preserve"> estos deberán utilizar imágenes o fuentes de iconos estándar y reconocibles para cada red social, y su tamaño, color y espaciado deberán ser consistentes con el diseño general y la guía de estilo del Portal Público.</w:t>
       </w:r>

</xml_diff>